<commit_message>
charts, guide, example files
</commit_message>
<xml_diff>
--- a/MANUALE_UTENTE.docx
+++ b/MANUALE_UTENTE.docx
@@ -4668,7 +4668,7 @@
                 <w:sz w:val="20"/>
                 <w:szCs w:val="20"/>
               </w:rPr>
-              <w:t xml:space="preserve"> Contiene l'elenco di tutti i tipi di campo (</w:t>
+              <w:t xml:space="preserve"> In cima contiene l'elenco di tutti i tipi di campo disponibili (</w:t>
             </w:r>
             <w:r>
               <w:rPr>
@@ -4684,7 +4684,23 @@
                 <w:sz w:val="20"/>
                 <w:szCs w:val="20"/>
               </w:rPr>
-              <w:t xml:space="preserve">) e le liste </w:t>
+              <w:t xml:space="preserve">) e la classe </w:t>
+            </w:r>
+            <w:r>
+              <w:rPr>
+                <w:rFonts w:ascii="Consolas" w:eastAsia="Consolas" w:hAnsi="Consolas" w:cs="Consolas"/>
+                <w:sz w:val="20"/>
+                <w:szCs w:val="20"/>
+                <w:shd w:val="clear" w:color="auto" w:fill="F2F2F2"/>
+              </w:rPr>
+              <w:t>DynamicChartField</w:t>
+            </w:r>
+            <w:r>
+              <w:rPr>
+                <w:sz w:val="20"/>
+                <w:szCs w:val="20"/>
+              </w:rPr>
+              <w:t xml:space="preserve"> per i grafici; in fondo al file (sezione 7, suddivisa in 7.1/7.2/7.3, una sottosezione per pagina) ci sono le liste vere e proprie: </w:t>
             </w:r>
             <w:r>
               <w:rPr>
@@ -4700,7 +4716,7 @@
                 <w:sz w:val="20"/>
                 <w:szCs w:val="20"/>
               </w:rPr>
-              <w:t xml:space="preserve"> (statica) e </w:t>
+              <w:t xml:space="preserve"> (statica), </w:t>
             </w:r>
             <w:r>
               <w:rPr>
@@ -4716,7 +4732,169 @@
                 <w:sz w:val="20"/>
                 <w:szCs w:val="20"/>
               </w:rPr>
-              <w:t xml:space="preserve"> (live). Qui si aggiungono/tolgono/modificano i campi, copiando gli esempi.</w:t>
+              <w:t xml:space="preserve"> (live, invia) e </w:t>
+            </w:r>
+            <w:r>
+              <w:rPr>
+                <w:rFonts w:ascii="Consolas" w:eastAsia="Consolas" w:hAnsi="Consolas" w:cs="Consolas"/>
+                <w:sz w:val="20"/>
+                <w:szCs w:val="20"/>
+                <w:shd w:val="clear" w:color="auto" w:fill="F2F2F2"/>
+              </w:rPr>
+              <w:t>receiverPageSchema</w:t>
+            </w:r>
+            <w:r>
+              <w:rPr>
+                <w:sz w:val="20"/>
+                <w:szCs w:val="20"/>
+              </w:rPr>
+              <w:t xml:space="preserve">/</w:t>
+            </w:r>
+            <w:r>
+              <w:rPr>
+                <w:rFonts w:ascii="Consolas" w:eastAsia="Consolas" w:hAnsi="Consolas" w:cs="Consolas"/>
+                <w:sz w:val="20"/>
+                <w:szCs w:val="20"/>
+                <w:shd w:val="clear" w:color="auto" w:fill="F2F2F2"/>
+              </w:rPr>
+              <w:t>receiverChartSchema</w:t>
+            </w:r>
+            <w:r>
+              <w:rPr>
+                <w:sz w:val="20"/>
+                <w:szCs w:val="20"/>
+              </w:rPr>
+              <w:t xml:space="preserve"> (Listener, riceve campi e grafici insieme — vedi sezione 12). Qui si aggiungono/tolgono/modificano i campi e i grafici dei form, copiando gli esempi.</w:t>
+            </w:r>
+          </w:p>
+        </w:tc>
+      </w:tr>
+      <w:tr>
+        <w:tc>
+          <w:tcPr>
+            <w:tcW w:w="3200" w:type="dxa"/>
+            <w:tcMar>
+              <w:top w:w="60" w:type="dxa"/>
+              <w:left w:w="100" w:type="dxa"/>
+              <w:bottom w:w="60" w:type="dxa"/>
+              <w:right w:w="100" w:type="dxa"/>
+            </w:tcMar>
+          </w:tcPr>
+          <w:p>
+            <w:pPr>
+              <w:spacing w:line="260" w:lineRule="auto"/>
+            </w:pPr>
+            <w:r>
+              <w:rPr>
+                <w:rFonts w:ascii="Consolas" w:eastAsia="Consolas" w:hAnsi="Consolas" w:cs="Consolas"/>
+                <w:sz w:val="20"/>
+                <w:szCs w:val="20"/>
+                <w:shd w:val="clear" w:color="auto" w:fill="F2F2F2"/>
+              </w:rPr>
+              <w:t>lib/audio_page.dart.example</w:t>
+            </w:r>
+            <w:r>
+              <w:rPr>
+                <w:sz w:val="20"/>
+                <w:szCs w:val="20"/>
+              </w:rPr>
+              <w:t xml:space="preserve">, </w:t>
+            </w:r>
+            <w:r>
+              <w:rPr>
+                <w:rFonts w:ascii="Consolas" w:eastAsia="Consolas" w:hAnsi="Consolas" w:cs="Consolas"/>
+                <w:sz w:val="20"/>
+                <w:szCs w:val="20"/>
+                <w:shd w:val="clear" w:color="auto" w:fill="F2F2F2"/>
+              </w:rPr>
+              <w:t>lib/audio_live_page.dart.example</w:t>
+            </w:r>
+            <w:r>
+              <w:rPr>
+                <w:sz w:val="20"/>
+                <w:szCs w:val="20"/>
+              </w:rPr>
+              <w:t xml:space="preserve">, </w:t>
+            </w:r>
+            <w:r>
+              <w:rPr>
+                <w:rFonts w:ascii="Consolas" w:eastAsia="Consolas" w:hAnsi="Consolas" w:cs="Consolas"/>
+                <w:sz w:val="20"/>
+                <w:szCs w:val="20"/>
+                <w:shd w:val="clear" w:color="auto" w:fill="F2F2F2"/>
+              </w:rPr>
+              <w:t>lib/sensor_receiver_page.dart.example</w:t>
+            </w:r>
+          </w:p>
+        </w:tc>
+        <w:tc>
+          <w:tcPr>
+            <w:tcW w:w="5826" w:type="dxa"/>
+            <w:tcMar>
+              <w:top w:w="60" w:type="dxa"/>
+              <w:left w:w="100" w:type="dxa"/>
+              <w:bottom w:w="60" w:type="dxa"/>
+              <w:right w:w="100" w:type="dxa"/>
+            </w:tcMar>
+          </w:tcPr>
+          <w:p>
+            <w:pPr>
+              <w:spacing w:line="260" w:lineRule="auto"/>
+            </w:pPr>
+            <w:r>
+              <w:rPr>
+                <w:sz w:val="20"/>
+                <w:szCs w:val="20"/>
+              </w:rPr>
+              <w:t xml:space="preserve">Pagine di esempio già pronte, usate nei tutorial delle sezioni 5, 6 e 12.6. L’estensione </w:t>
+            </w:r>
+            <w:r>
+              <w:rPr>
+                <w:rFonts w:ascii="Consolas" w:eastAsia="Consolas" w:hAnsi="Consolas" w:cs="Consolas"/>
+                <w:sz w:val="20"/>
+                <w:szCs w:val="20"/>
+                <w:shd w:val="clear" w:color="auto" w:fill="F2F2F2"/>
+              </w:rPr>
+              <w:t>.dart.example</w:t>
+            </w:r>
+            <w:r>
+              <w:rPr>
+                <w:sz w:val="20"/>
+                <w:szCs w:val="20"/>
+              </w:rPr>
+              <w:t xml:space="preserve"> (invece di </w:t>
+            </w:r>
+            <w:r>
+              <w:rPr>
+                <w:rFonts w:ascii="Consolas" w:eastAsia="Consolas" w:hAnsi="Consolas" w:cs="Consolas"/>
+                <w:sz w:val="20"/>
+                <w:szCs w:val="20"/>
+                <w:shd w:val="clear" w:color="auto" w:fill="F2F2F2"/>
+              </w:rPr>
+              <w:t>.dart</w:t>
+            </w:r>
+            <w:r>
+              <w:rPr>
+                <w:sz w:val="20"/>
+                <w:szCs w:val="20"/>
+              </w:rPr>
+              <w:t xml:space="preserve">) fa sì che Flutter le ignori completamente finché restano così: basta rinominarle togliendo </w:t>
+            </w:r>
+            <w:r>
+              <w:rPr>
+                <w:rFonts w:ascii="Consolas" w:eastAsia="Consolas" w:hAnsi="Consolas" w:cs="Consolas"/>
+                <w:sz w:val="20"/>
+                <w:szCs w:val="20"/>
+                <w:shd w:val="clear" w:color="auto" w:fill="F2F2F2"/>
+              </w:rPr>
+              <w:t>.example</w:t>
+            </w:r>
+            <w:r>
+              <w:rPr>
+                <w:sz w:val="20"/>
+                <w:szCs w:val="20"/>
+              </w:rPr>
+              <w:t xml:space="preserve"> per attivarle davvero.</w:t>
             </w:r>
           </w:p>
         </w:tc>
@@ -12109,18 +12287,18 @@
         <w:t>DynamicFormField</w:t>
       </w:r>
       <w:r>
-        <w:t xml:space="preserve">), definita in </w:t>
-      </w:r>
-      <w:r>
-        <w:rPr>
-          <w:rFonts w:ascii="Consolas" w:eastAsia="Consolas" w:hAnsi="Consolas" w:cs="Consolas"/>
-          <w:sz w:val="20"/>
-          <w:szCs w:val="20"/>
-        </w:rPr>
-        <w:t>lib/chart_schema.dart</w:t>
-      </w:r>
-      <w:r>
-        <w:t xml:space="preserve">; il disegno è gestito da </w:t>
+        <w:t xml:space="preserve">), definita nello stesso file dei campi, </w:t>
+      </w:r>
+      <w:r>
+        <w:rPr>
+          <w:rFonts w:ascii="Consolas" w:eastAsia="Consolas" w:hAnsi="Consolas" w:cs="Consolas"/>
+          <w:sz w:val="20"/>
+          <w:szCs w:val="20"/>
+        </w:rPr>
+        <w:t>lib/form_schema.dart</w:t>
+      </w:r>
+      <w:r>
+        <w:t xml:space="preserve"> (sezione 6); il disegno è gestito da </w:t>
       </w:r>
       <w:r>
         <w:rPr>
@@ -13203,6 +13381,86 @@
     </w:p>
     <w:p>
       <w:pPr>
+        <w:pBdr>
+          <w:left w:val="single" w:sz="12" w:space="8" w:color="1B7A3D"/>
+        </w:pBdr>
+        <w:shd w:val="clear" w:color="auto" w:fill="E7F5EA"/>
+        <w:spacing w:before="120" w:after="160" w:line="276" w:lineRule="auto"/>
+      </w:pPr>
+      <w:r>
+        <w:rPr>
+          <w:b/>
+          <w:bCs/>
+          <w:color w:val="1B7A3D"/>
+        </w:rPr>
+        <w:t xml:space="preserve">💡 Scorciatoia: </w:t>
+      </w:r>
+      <w:r>
+        <w:t xml:space="preserve">l'esempio di questo tutorial esiste già, pronto all'uso, in </w:t>
+      </w:r>
+      <w:r>
+        <w:rPr>
+          <w:rFonts w:ascii="Consolas" w:eastAsia="Consolas" w:hAnsi="Consolas" w:cs="Consolas"/>
+          <w:sz w:val="20"/>
+          <w:szCs w:val="20"/>
+          <w:shd w:val="clear" w:color="auto" w:fill="F2F2F2"/>
+        </w:rPr>
+        <w:t>lib/audio_page.dart.example</w:t>
+      </w:r>
+      <w:r>
+        <w:t xml:space="preserve">. Basta rinominarlo in </w:t>
+      </w:r>
+      <w:r>
+        <w:rPr>
+          <w:rFonts w:ascii="Consolas" w:eastAsia="Consolas" w:hAnsi="Consolas" w:cs="Consolas"/>
+          <w:sz w:val="20"/>
+          <w:szCs w:val="20"/>
+          <w:shd w:val="clear" w:color="auto" w:fill="F2F2F2"/>
+        </w:rPr>
+        <w:t>lib/audio_page.dart</w:t>
+      </w:r>
+      <w:r>
+        <w:t xml:space="preserve"> (togliendo </w:t>
+      </w:r>
+      <w:r>
+        <w:rPr>
+          <w:rFonts w:ascii="Consolas" w:eastAsia="Consolas" w:hAnsi="Consolas" w:cs="Consolas"/>
+          <w:sz w:val="20"/>
+          <w:szCs w:val="20"/>
+          <w:shd w:val="clear" w:color="auto" w:fill="F2F2F2"/>
+        </w:rPr>
+        <w:t>.example</w:t>
+      </w:r>
+      <w:r>
+        <w:t xml:space="preserve">), spostare la lista </w:t>
+      </w:r>
+      <w:r>
+        <w:rPr>
+          <w:rFonts w:ascii="Consolas" w:eastAsia="Consolas" w:hAnsi="Consolas" w:cs="Consolas"/>
+          <w:sz w:val="20"/>
+          <w:szCs w:val="20"/>
+          <w:shd w:val="clear" w:color="auto" w:fill="F2F2F2"/>
+        </w:rPr>
+        <w:t>audioPageSchema</w:t>
+      </w:r>
+      <w:r>
+        <w:t xml:space="preserve"> che contiene dentro </w:t>
+      </w:r>
+      <w:r>
+        <w:rPr>
+          <w:rFonts w:ascii="Consolas" w:eastAsia="Consolas" w:hAnsi="Consolas" w:cs="Consolas"/>
+          <w:sz w:val="20"/>
+          <w:szCs w:val="20"/>
+          <w:shd w:val="clear" w:color="auto" w:fill="F2F2F2"/>
+        </w:rPr>
+        <w:t>lib/form_schema.dart</w:t>
+      </w:r>
+      <w:r>
+        <w:t xml:space="preserve"> (sezione 7.1) e fare il Passo 3 qui sotto — non serve ricopiare a mano il codice dei Passi 1-2. I due passi che seguono restano comunque utili per capire COSA fa quel file e replicare la stessa idea con una pagina diversa dalla tua.</w:t>
+      </w:r>
+    </w:p>
+    <w:p>
+      <w:pPr>
         <w:pStyle w:val="Titolo2"/>
       </w:pPr>
       <w:r>
@@ -13226,7 +13484,7 @@
         <w:t>lib/form_schema.dart</w:t>
       </w:r>
       <w:r>
-        <w:t xml:space="preserve"> e, in fondo al file, aggiungi una nuova lista copiando lo stile di </w:t>
+        <w:t xml:space="preserve"> e, in fondo al file (sezione 7.1, vicino a formPageSchema), aggiungi una nuova lista copiando lo stile di </w:t>
       </w:r>
       <w:r>
         <w:rPr>
@@ -16795,6 +17053,74 @@
           <w:szCs w:val="19"/>
         </w:rPr>
         <w:t>),</w:t>
+      </w:r>
+    </w:p>
+    <w:p>
+      <w:pPr>
+        <w:pBdr>
+          <w:left w:val="single" w:sz="12" w:space="8" w:color="1B7A3D"/>
+        </w:pBdr>
+        <w:shd w:val="clear" w:color="auto" w:fill="E7F5EA"/>
+        <w:spacing w:before="120" w:after="160" w:line="276" w:lineRule="auto"/>
+      </w:pPr>
+      <w:r>
+        <w:rPr>
+          <w:b/>
+          <w:bCs/>
+          <w:color w:val="1B7A3D"/>
+        </w:rPr>
+        <w:t xml:space="preserve">💡 Scorciatoia: </w:t>
+      </w:r>
+      <w:r>
+        <w:t xml:space="preserve">anche per questo tutorial esiste già un esempio pronto all'uso in </w:t>
+      </w:r>
+      <w:r>
+        <w:rPr>
+          <w:rFonts w:ascii="Consolas" w:eastAsia="Consolas" w:hAnsi="Consolas" w:cs="Consolas"/>
+          <w:sz w:val="20"/>
+          <w:szCs w:val="20"/>
+          <w:shd w:val="clear" w:color="auto" w:fill="F2F2F2"/>
+        </w:rPr>
+        <w:t>lib/audio_live_page.dart.example</w:t>
+      </w:r>
+      <w:r>
+        <w:t xml:space="preserve">. Basta rinominarlo in </w:t>
+      </w:r>
+      <w:r>
+        <w:rPr>
+          <w:rFonts w:ascii="Consolas" w:eastAsia="Consolas" w:hAnsi="Consolas" w:cs="Consolas"/>
+          <w:sz w:val="20"/>
+          <w:szCs w:val="20"/>
+          <w:shd w:val="clear" w:color="auto" w:fill="F2F2F2"/>
+        </w:rPr>
+        <w:t>lib/audio_live_page.dart</w:t>
+      </w:r>
+      <w:r>
+        <w:t xml:space="preserve">, spostare la lista </w:t>
+      </w:r>
+      <w:r>
+        <w:rPr>
+          <w:rFonts w:ascii="Consolas" w:eastAsia="Consolas" w:hAnsi="Consolas" w:cs="Consolas"/>
+          <w:sz w:val="20"/>
+          <w:szCs w:val="20"/>
+          <w:shd w:val="clear" w:color="auto" w:fill="F2F2F2"/>
+        </w:rPr>
+        <w:t>audioLivePageSchema</w:t>
+      </w:r>
+      <w:r>
+        <w:t xml:space="preserve"> che contiene dentro </w:t>
+      </w:r>
+      <w:r>
+        <w:rPr>
+          <w:rFonts w:ascii="Consolas" w:eastAsia="Consolas" w:hAnsi="Consolas" w:cs="Consolas"/>
+          <w:sz w:val="20"/>
+          <w:szCs w:val="20"/>
+          <w:shd w:val="clear" w:color="auto" w:fill="F2F2F2"/>
+        </w:rPr>
+        <w:t>lib/form_schema.dart</w:t>
+      </w:r>
+      <w:r>
+        <w:t xml:space="preserve"> (sezione 7.2) e fare il Passo 3 qui sotto.</w:t>
       </w:r>
     </w:p>
     <w:p>
@@ -21687,7 +22013,7 @@
         <w:t>receiverPageSchema</w:t>
       </w:r>
       <w:r>
-        <w:t xml:space="preserve"> (in fondo al file):</w:t>
+        <w:t xml:space="preserve"> (sezione 7.3, in fondo al file):</w:t>
       </w:r>
     </w:p>
     <w:p>
@@ -22153,7 +22479,7 @@
         <w:t>receiverPageSchema</w:t>
       </w:r>
       <w:r>
-        <w:t>, con l'</w:t>
+        <w:t xml:space="preserve"> (sezione 7.3), con l'</w:t>
       </w:r>
       <w:r>
         <w:rPr>
@@ -23362,47 +23688,127 @@
     </w:p>
     <w:p>
       <w:pPr>
-        <w:pStyle w:val="Titolo2"/>
-      </w:pPr>
-      <w:r>
-        <w:t>Passo 1 — Aggiungi gli schemi dei campi "riceventi" e dei grafici</w:t>
-      </w:r>
-    </w:p>
-    <w:p>
-      <w:pPr>
-        <w:spacing w:after="160" w:line="276" w:lineRule="auto"/>
-      </w:pPr>
-      <w:r>
-        <w:t xml:space="preserve">In </w:t>
-      </w:r>
-      <w:r>
-        <w:rPr>
-          <w:rFonts w:ascii="Consolas" w:eastAsia="Consolas" w:hAnsi="Consolas" w:cs="Consolas"/>
-          <w:sz w:val="20"/>
-          <w:szCs w:val="20"/>
-          <w:shd w:val="clear" w:color="auto" w:fill="F2F2F2"/>
-        </w:rPr>
-        <w:t xml:space="preserve">lib/form_schema.dart</w:t>
-      </w:r>
-      <w:r>
-        <w:t xml:space="preserve">, vicino a </w:t>
-      </w:r>
-      <w:r>
-        <w:rPr>
-          <w:rFonts w:ascii="Consolas" w:eastAsia="Consolas" w:hAnsi="Consolas" w:cs="Consolas"/>
-          <w:sz w:val="20"/>
-          <w:szCs w:val="20"/>
-          <w:shd w:val="clear" w:color="auto" w:fill="F2F2F2"/>
-        </w:rPr>
-        <w:t xml:space="preserve">receiverPageSchema</w:t>
-      </w:r>
-      <w:r>
-        <w:t xml:space="preserve">, aggiungi una nuova lista con i </w:t>
-      </w:r>
+        <w:pBdr>
+          <w:left w:val="single" w:sz="12" w:space="8" w:color="1B7A3D"/>
+        </w:pBdr>
+        <w:shd w:val="clear" w:color="auto" w:fill="E7F5EA"/>
+        <w:spacing w:before="120" w:after="160" w:line="276" w:lineRule="auto"/>
+      </w:pPr>
       <w:r>
         <w:rPr>
           <w:b/>
           <w:bCs/>
+          <w:color w:val="1B7A3D"/>
+        </w:rPr>
+        <w:t xml:space="preserve">💡 Scorciatoia: </w:t>
+      </w:r>
+      <w:r>
+        <w:t xml:space="preserve">questo intero esempio esiste già, pronto all'uso, in </w:t>
+      </w:r>
+      <w:r>
+        <w:rPr>
+          <w:rFonts w:ascii="Consolas" w:eastAsia="Consolas" w:hAnsi="Consolas" w:cs="Consolas"/>
+          <w:sz w:val="20"/>
+          <w:szCs w:val="20"/>
+          <w:shd w:val="clear" w:color="auto" w:fill="F2F2F2"/>
+        </w:rPr>
+        <w:t>lib/sensor_receiver_page.dart.example</w:t>
+      </w:r>
+      <w:r>
+        <w:t xml:space="preserve"> (già impostato sulla porta 9001). Basta rinominarlo in </w:t>
+      </w:r>
+      <w:r>
+        <w:rPr>
+          <w:rFonts w:ascii="Consolas" w:eastAsia="Consolas" w:hAnsi="Consolas" w:cs="Consolas"/>
+          <w:sz w:val="20"/>
+          <w:szCs w:val="20"/>
+          <w:shd w:val="clear" w:color="auto" w:fill="F2F2F2"/>
+        </w:rPr>
+        <w:t>lib/sensor_receiver_page.dart</w:t>
+      </w:r>
+      <w:r>
+        <w:t xml:space="preserve">, spostare </w:t>
+      </w:r>
+      <w:r>
+        <w:rPr>
+          <w:rFonts w:ascii="Consolas" w:eastAsia="Consolas" w:hAnsi="Consolas" w:cs="Consolas"/>
+          <w:sz w:val="20"/>
+          <w:szCs w:val="20"/>
+          <w:shd w:val="clear" w:color="auto" w:fill="F2F2F2"/>
+        </w:rPr>
+        <w:t>sensorPageSchema</w:t>
+      </w:r>
+      <w:r>
+        <w:t xml:space="preserve">/</w:t>
+      </w:r>
+      <w:r>
+        <w:rPr>
+          <w:rFonts w:ascii="Consolas" w:eastAsia="Consolas" w:hAnsi="Consolas" w:cs="Consolas"/>
+          <w:sz w:val="20"/>
+          <w:szCs w:val="20"/>
+          <w:shd w:val="clear" w:color="auto" w:fill="F2F2F2"/>
+        </w:rPr>
+        <w:t>sensorChartSchema</w:t>
+      </w:r>
+      <w:r>
+        <w:t xml:space="preserve"> che contiene dentro </w:t>
+      </w:r>
+      <w:r>
+        <w:rPr>
+          <w:rFonts w:ascii="Consolas" w:eastAsia="Consolas" w:hAnsi="Consolas" w:cs="Consolas"/>
+          <w:sz w:val="20"/>
+          <w:szCs w:val="20"/>
+          <w:shd w:val="clear" w:color="auto" w:fill="F2F2F2"/>
+        </w:rPr>
+        <w:t>lib/form_schema.dart</w:t>
+      </w:r>
+      <w:r>
+        <w:t xml:space="preserve"> (sezione 7.3) e fare il Passo 3 qui sotto.</w:t>
+      </w:r>
+    </w:p>
+    <w:p>
+      <w:pPr>
+        <w:pStyle w:val="Titolo2"/>
+      </w:pPr>
+      <w:r>
+        <w:t>Passo 1 — Aggiungi gli schemi dei campi "riceventi" e dei grafici</w:t>
+      </w:r>
+    </w:p>
+    <w:p>
+      <w:pPr>
+        <w:spacing w:after="160" w:line="276" w:lineRule="auto"/>
+      </w:pPr>
+      <w:r>
+        <w:t xml:space="preserve">In </w:t>
+      </w:r>
+      <w:r>
+        <w:rPr>
+          <w:rFonts w:ascii="Consolas" w:eastAsia="Consolas" w:hAnsi="Consolas" w:cs="Consolas"/>
+          <w:sz w:val="20"/>
+          <w:szCs w:val="20"/>
+          <w:shd w:val="clear" w:color="auto" w:fill="F2F2F2"/>
+        </w:rPr>
+        <w:t xml:space="preserve">lib/form_schema.dart</w:t>
+      </w:r>
+      <w:r>
+        <w:t xml:space="preserve">, vicino a </w:t>
+      </w:r>
+      <w:r>
+        <w:rPr>
+          <w:rFonts w:ascii="Consolas" w:eastAsia="Consolas" w:hAnsi="Consolas" w:cs="Consolas"/>
+          <w:sz w:val="20"/>
+          <w:szCs w:val="20"/>
+          <w:shd w:val="clear" w:color="auto" w:fill="F2F2F2"/>
+        </w:rPr>
+        <w:t xml:space="preserve">receiverPageSchema</w:t>
+      </w:r>
+      <w:r>
+        <w:t xml:space="preserve"> (sezione 7.3), aggiungi una nuova lista con i </w:t>
+      </w:r>
+      <w:r>
+        <w:rPr>
+          <w:b/>
+          <w:bCs/>
         </w:rPr>
         <w:t xml:space="preserve">due campi in sola lettura</w:t>
       </w:r>
@@ -23737,7 +24143,7 @@
         <w:spacing w:after="160" w:line="276" w:lineRule="auto"/>
       </w:pPr>
       <w:r>
-        <w:t xml:space="preserve">E in </w:t>
+        <w:t xml:space="preserve">Sempre in </w:t>
       </w:r>
       <w:r>
         <w:rPr>
@@ -23746,10 +24152,10 @@
           <w:szCs w:val="20"/>
           <w:shd w:val="clear" w:color="auto" w:fill="F2F2F2"/>
         </w:rPr>
-        <w:t xml:space="preserve">lib/chart_schema.dart</w:t>
-      </w:r>
-      <w:r>
-        <w:t xml:space="preserve">, vicino a </w:t>
+        <w:t xml:space="preserve">lib/form_schema.dart</w:t>
+      </w:r>
+      <w:r>
+        <w:t xml:space="preserve"> (sezione 7.3, in fondo al file, vicino a </w:t>
       </w:r>
       <w:r>
         <w:rPr>
@@ -23761,7 +24167,7 @@
         <w:t xml:space="preserve">receiverChartSchema</w:t>
       </w:r>
       <w:r>
-        <w:t xml:space="preserve">, aggiungi i </w:t>
+        <w:t xml:space="preserve">), aggiungi i </w:t>
       </w:r>
       <w:r>
         <w:rPr>
@@ -25375,10 +25781,10 @@
           <w:sz w:val="20"/>
           <w:szCs w:val="20"/>
         </w:rPr>
-        <w:t>lib/chart_schema.dart</w:t>
-      </w:r>
-      <w:r>
-        <w:t>) e un motore di disegno che la trasforma nel widget giusto (</w:t>
+        <w:t>lib/form_schema.dart</w:t>
+      </w:r>
+      <w:r>
+        <w:t xml:space="preserve">, sezione 6) e un motore di disegno che la trasforma nel widget giusto (</w:t>
       </w:r>
       <w:r>
         <w:rPr>
@@ -25406,15 +25812,18 @@
         <w:spacing w:after="160" w:line="276" w:lineRule="auto"/>
       </w:pPr>
       <w:r>
-        <w:rPr>
-          <w:rFonts w:ascii="Consolas" w:eastAsia="Consolas" w:hAnsi="Consolas" w:cs="Consolas"/>
-          <w:sz w:val="20"/>
-          <w:szCs w:val="20"/>
-        </w:rPr>
-        <w:t>lib/chart_schema.dart</w:t>
-      </w:r>
-      <w:r>
-        <w:t xml:space="preserve"> contiene:</w:t>
+        <w:t xml:space="preserve">Nella parte alta di </w:t>
+      </w:r>
+      <w:r>
+        <w:rPr>
+          <w:rFonts w:ascii="Consolas" w:eastAsia="Consolas" w:hAnsi="Consolas" w:cs="Consolas"/>
+          <w:sz w:val="20"/>
+          <w:szCs w:val="20"/>
+        </w:rPr>
+        <w:t>lib/form_schema.dart</w:t>
+      </w:r>
+      <w:r>
+        <w:t xml:space="preserve"> (sezione 6, subito dopo gli esempi di campo):</w:t>
       </w:r>
     </w:p>
     <w:p>
@@ -25559,7 +25968,7 @@
         <w:t>receiverChartSchema</w:t>
       </w:r>
       <w:r>
-        <w:t>, in fondo allo stesso file:</w:t>
+        <w:t xml:space="preserve">, in fondo allo stesso file (sezione 7.3, subito sotto receiverPageSchema):</w:t>
       </w:r>
     </w:p>
     <w:p>
@@ -26084,10 +26493,10 @@
           <w:sz w:val="20"/>
           <w:szCs w:val="20"/>
         </w:rPr>
-        <w:t>lib/chart_schema.dart</w:t>
-      </w:r>
-      <w:r>
-        <w:t xml:space="preserve"> e aggiungi una riga </w:t>
+        <w:t>lib/form_schema.dart</w:t>
+      </w:r>
+      <w:r>
+        <w:t xml:space="preserve"> (sezione 7.3, in fondo al file) e aggiungi una riga </w:t>
       </w:r>
       <w:r>
         <w:rPr>
@@ -26642,10 +27051,10 @@
           <w:sz w:val="20"/>
           <w:szCs w:val="20"/>
         </w:rPr>
-        <w:t>chart_schema.dart</w:t>
-      </w:r>
-      <w:r>
-        <w:t xml:space="preserve">) e un nuovo </w:t>
+        <w:t>form_schema.dart</w:t>
+      </w:r>
+      <w:r>
+        <w:t xml:space="preserve">, sezione 6) e un nuovo </w:t>
       </w:r>
       <w:r>
         <w:rPr>

</xml_diff>

<commit_message>
test osc receiver tool
</commit_message>
<xml_diff>
--- a/MANUALE_UTENTE.docx
+++ b/MANUALE_UTENTE.docx
@@ -19797,36 +19797,8 @@
           <w:sz w:val="20"/>
           <w:szCs w:val="20"/>
         </w:rPr>
-        <w:t>~</w:t>
-      </w:r>
-      <w:proofErr w:type="gramStart"/>
-      <w:r>
-        <w:rPr>
-          <w:rFonts w:ascii="Consolas" w:eastAsia="Consolas" w:hAnsi="Consolas" w:cs="Consolas"/>
-          <w:sz w:val="20"/>
-          <w:szCs w:val="20"/>
-        </w:rPr>
-        <w:t>/.</w:t>
-      </w:r>
-      <w:proofErr w:type="spellStart"/>
-      <w:r>
-        <w:rPr>
-          <w:rFonts w:ascii="Consolas" w:eastAsia="Consolas" w:hAnsi="Consolas" w:cs="Consolas"/>
-          <w:sz w:val="20"/>
-          <w:szCs w:val="20"/>
-        </w:rPr>
-        <w:t>emulator</w:t>
-      </w:r>
-      <w:proofErr w:type="gramEnd"/>
-      <w:r>
-        <w:rPr>
-          <w:rFonts w:ascii="Consolas" w:eastAsia="Consolas" w:hAnsi="Consolas" w:cs="Consolas"/>
-          <w:sz w:val="20"/>
-          <w:szCs w:val="20"/>
-        </w:rPr>
-        <w:t>_console_auth_token</w:t>
-      </w:r>
-      <w:proofErr w:type="spellEnd"/>
+        <w:t>~/.emulator_console_auth_token</w:t>
+      </w:r>
       <w:r>
         <w:t xml:space="preserve"> (per Windows: </w:t>
       </w:r>
@@ -19836,36 +19808,8 @@
           <w:sz w:val="20"/>
           <w:szCs w:val="20"/>
         </w:rPr>
-        <w:t>%USERPROFILE%</w:t>
-      </w:r>
-      <w:proofErr w:type="gramStart"/>
-      <w:r>
-        <w:rPr>
-          <w:rFonts w:ascii="Consolas" w:eastAsia="Consolas" w:hAnsi="Consolas" w:cs="Consolas"/>
-          <w:sz w:val="20"/>
-          <w:szCs w:val="20"/>
-        </w:rPr>
-        <w:t>\.</w:t>
-      </w:r>
-      <w:proofErr w:type="spellStart"/>
-      <w:r>
-        <w:rPr>
-          <w:rFonts w:ascii="Consolas" w:eastAsia="Consolas" w:hAnsi="Consolas" w:cs="Consolas"/>
-          <w:sz w:val="20"/>
-          <w:szCs w:val="20"/>
-        </w:rPr>
-        <w:t>emulator</w:t>
-      </w:r>
-      <w:proofErr w:type="gramEnd"/>
-      <w:r>
-        <w:rPr>
-          <w:rFonts w:ascii="Consolas" w:eastAsia="Consolas" w:hAnsi="Consolas" w:cs="Consolas"/>
-          <w:sz w:val="20"/>
-          <w:szCs w:val="20"/>
-        </w:rPr>
-        <w:t>_console_auth_token</w:t>
-      </w:r>
-      <w:proofErr w:type="spellEnd"/>
+        <w:t>%USERPROFILE%\.emulator_console_auth_token</w:t>
+      </w:r>
       <w:r>
         <w:t>):</w:t>
       </w:r>
@@ -27166,7 +27110,7 @@
         <w:t>flutter_test</w:t>
       </w:r>
       <w:r>
-        <w:t xml:space="preserve">, verificano che il codice si comporti come previsto) sia uno </w:t>
+        <w:t xml:space="preserve">, verificano che il codice si comporti come previsto) sia due </w:t>
       </w:r>
       <w:r>
         <w:rPr>
@@ -27176,7 +27120,29 @@
         <w:t>script di test manuale</w:t>
       </w:r>
       <w:r>
-        <w:t xml:space="preserve"> (per vedere l'app "in azione" con dati finti, senza un visore vero collegato). Non serve capire il codice per usarli: bastano i comandi qui sotto.</w:t>
+        <w:t xml:space="preserve">, uno per direzione: </w:t>
+      </w:r>
+      <w:r>
+        <w:rPr>
+          <w:rFonts w:ascii="Consolas" w:eastAsia="Consolas" w:hAnsi="Consolas" w:cs="Consolas"/>
+          <w:sz w:val="20"/>
+          <w:szCs w:val="20"/>
+        </w:rPr>
+        <w:t>test_osc_sender.py</w:t>
+      </w:r>
+      <w:r>
+        <w:t xml:space="preserve"> manda dati finti ALL'app (per provare la pagina Listener senza un visore vero), </w:t>
+      </w:r>
+      <w:r>
+        <w:rPr>
+          <w:rFonts w:ascii="Consolas" w:eastAsia="Consolas" w:hAnsi="Consolas" w:cs="Consolas"/>
+          <w:sz w:val="20"/>
+          <w:szCs w:val="20"/>
+        </w:rPr>
+        <w:t>test_osc_receiver.py</w:t>
+      </w:r>
+      <w:r>
+        <w:t xml:space="preserve"> fa l'opposto e riceve i dati che l'app INVIA (per provare "Init Settings"/"Live Change" senza un visore vero dall'altra parte). Non serve capire il codice per usarli: bastano i comandi qui sotto.</w:t>
       </w:r>
     </w:p>
     <w:p>
@@ -27518,7 +27484,7 @@
         <w:pStyle w:val="Titolo2"/>
       </w:pPr>
       <w:r>
-        <w:t>14.2 Test manuale in tempo reale (tools/test_osc_sender.py)</w:t>
+        <w:t>14.2 Simulare il visore che INVIA dati (tools/test_osc_sender.py)</w:t>
       </w:r>
     </w:p>
     <w:p>
@@ -27910,6 +27876,474 @@
     </w:tbl>
     <w:p>
       <w:pPr>
+        <w:pStyle w:val="Titolo2"/>
+      </w:pPr>
+      <w:r>
+        <w:t>14.3 Simulare il dispositivo che RICEVE dati (tools/test_osc_receiver.py)</w:t>
+      </w:r>
+    </w:p>
+    <w:p>
+      <w:pPr>
+        <w:spacing w:after="160" w:line="276" w:lineRule="auto"/>
+      </w:pPr>
+      <w:r>
+        <w:t xml:space="preserve">Fa l'esatto opposto dello script precedente: invece di mandare dati finti all'app, si mette in ascolto e stampa a schermo i dati che </w:t>
+      </w:r>
+      <w:r>
+        <w:rPr>
+          <w:b/>
+          <w:bCs/>
+        </w:rPr>
+        <w:t>l'app invia verso l'esterno</w:t>
+      </w:r>
+      <w:r>
+        <w:t xml:space="preserve"> — cioè simula il visore VR (o qualunque altro software OSC, es. TouchOSC, Resolume) che normalmente li riceverebbe. Utile per verificare che "Init Settings" (pulsante "Invia via OSC") e "Live Change" (ogni campo, secondo il proprio </w:t>
+      </w:r>
+      <w:r>
+        <w:rPr>
+          <w:rFonts w:ascii="Consolas" w:eastAsia="Consolas" w:hAnsi="Consolas" w:cs="Consolas"/>
+          <w:sz w:val="20"/>
+          <w:szCs w:val="20"/>
+        </w:rPr>
+        <w:t>trigger</w:t>
+      </w:r>
+      <w:r>
+        <w:t xml:space="preserve"> — vedi sezione 3) mandino davvero i dati giusti, senza dover collegare un visore vero né uno strumento esterno di ispezione della rete.</w:t>
+      </w:r>
+    </w:p>
+    <w:p>
+      <w:pPr>
+        <w:spacing w:after="160" w:line="276" w:lineRule="auto"/>
+      </w:pPr>
+      <w:r>
+        <w:t>Richiede solo Python 3, come lo script precedente.</w:t>
+      </w:r>
+    </w:p>
+    <w:p>
+      <w:pPr>
+        <w:spacing w:after="160" w:line="276" w:lineRule="auto"/>
+      </w:pPr>
+      <w:r>
+        <w:t>Procedura:</w:t>
+      </w:r>
+    </w:p>
+    <w:p>
+      <w:pPr>
+        <w:pStyle w:val="Paragrafoelenco"/>
+        <w:numPr>
+          <w:ilvl w:val="0"/>
+          <w:numId w:val="18"/>
+        </w:numPr>
+        <w:spacing w:after="100" w:line="276" w:lineRule="auto"/>
+      </w:pPr>
+      <w:r>
+        <w:t xml:space="preserve">In un terminale, lancia lo script </w:t>
+      </w:r>
+      <w:r>
+        <w:rPr>
+          <w:b/>
+          <w:bCs/>
+        </w:rPr>
+        <w:t>prima</w:t>
+      </w:r>
+      <w:r>
+        <w:t xml:space="preserve"> di inviare qualunque dato dall'app:</w:t>
+      </w:r>
+    </w:p>
+    <w:p>
+      <w:pPr>
+        <w:pBdr>
+          <w:left w:val="single" w:sz="6" w:space="6" w:color="D0D0D0"/>
+        </w:pBdr>
+        <w:shd w:val="clear" w:color="auto" w:fill="F2F2F2"/>
+        <w:spacing w:before="80" w:after="160"/>
+        <w:ind w:left="720"/>
+      </w:pPr>
+      <w:r>
+        <w:rPr>
+          <w:rFonts w:ascii="Consolas" w:eastAsia="Consolas" w:hAnsi="Consolas" w:cs="Consolas"/>
+          <w:sz w:val="19"/>
+          <w:szCs w:val="19"/>
+        </w:rPr>
+        <w:t>python3 tools/test_osc_receiver.py</w:t>
+      </w:r>
+    </w:p>
+    <w:p>
+      <w:pPr>
+        <w:pStyle w:val="Paragrafoelenco"/>
+        <w:spacing w:after="100" w:line="276" w:lineRule="auto"/>
+        <w:ind w:left="720"/>
+      </w:pPr>
+      <w:r>
+        <w:t xml:space="preserve">Resta in ascolto su </w:t>
+      </w:r>
+      <w:r>
+        <w:rPr>
+          <w:rFonts w:ascii="Consolas" w:eastAsia="Consolas" w:hAnsi="Consolas" w:cs="Consolas"/>
+          <w:sz w:val="20"/>
+          <w:szCs w:val="20"/>
+        </w:rPr>
+        <w:t>0.0.0.0:9002</w:t>
+      </w:r>
+      <w:r>
+        <w:t xml:space="preserve"> per default (tutte le interfacce di rete di questo computer, porta </w:t>
+      </w:r>
+      <w:r>
+        <w:rPr>
+          <w:rFonts w:ascii="Consolas" w:eastAsia="Consolas" w:hAnsi="Consolas" w:cs="Consolas"/>
+          <w:sz w:val="20"/>
+          <w:szCs w:val="20"/>
+        </w:rPr>
+        <w:t>9002</w:t>
+      </w:r>
+      <w:r>
+        <w:t xml:space="preserve"> — diversa dalla </w:t>
+      </w:r>
+      <w:r>
+        <w:rPr>
+          <w:rFonts w:ascii="Consolas" w:eastAsia="Consolas" w:hAnsi="Consolas" w:cs="Consolas"/>
+          <w:sz w:val="20"/>
+          <w:szCs w:val="20"/>
+        </w:rPr>
+        <w:t>9000</w:t>
+      </w:r>
+      <w:r>
+        <w:t xml:space="preserve"> della pagina Listener, così i due script possono girare insieme sullo stesso computer senza conflitti).</w:t>
+      </w:r>
+    </w:p>
+    <w:p>
+      <w:pPr>
+        <w:pStyle w:val="Paragrafoelenco"/>
+        <w:numPr>
+          <w:ilvl w:val="0"/>
+          <w:numId w:val="18"/>
+        </w:numPr>
+        <w:spacing w:after="100" w:line="276" w:lineRule="auto"/>
+      </w:pPr>
+      <w:r>
+        <w:t xml:space="preserve">Avvia l'app e vai in </w:t>
+      </w:r>
+      <w:r>
+        <w:rPr>
+          <w:b/>
+          <w:bCs/>
+        </w:rPr>
+        <w:t>Impostazioni</w:t>
+      </w:r>
+      <w:r>
+        <w:t xml:space="preserve">: imposta come IP l'indirizzo del computer su cui gira lo script (se è lo stesso computer dell'app, va bene </w:t>
+      </w:r>
+      <w:r>
+        <w:rPr>
+          <w:rFonts w:ascii="Consolas" w:eastAsia="Consolas" w:hAnsi="Consolas" w:cs="Consolas"/>
+          <w:sz w:val="20"/>
+          <w:szCs w:val="20"/>
+        </w:rPr>
+        <w:t>127.0.0.1</w:t>
+      </w:r>
+      <w:r>
+        <w:t xml:space="preserve">) e come Porta </w:t>
+      </w:r>
+      <w:r>
+        <w:rPr>
+          <w:rFonts w:ascii="Consolas" w:eastAsia="Consolas" w:hAnsi="Consolas" w:cs="Consolas"/>
+          <w:sz w:val="20"/>
+          <w:szCs w:val="20"/>
+        </w:rPr>
+        <w:t>9002</w:t>
+      </w:r>
+      <w:r>
+        <w:t xml:space="preserve"> (o quella scelta con </w:t>
+      </w:r>
+      <w:r>
+        <w:rPr>
+          <w:rFonts w:ascii="Consolas" w:eastAsia="Consolas" w:hAnsi="Consolas" w:cs="Consolas"/>
+          <w:sz w:val="20"/>
+          <w:szCs w:val="20"/>
+        </w:rPr>
+        <w:t>--port</w:t>
+      </w:r>
+      <w:r>
+        <w:t xml:space="preserve">). Premi "Salva".</w:t>
+      </w:r>
+    </w:p>
+    <w:p>
+      <w:pPr>
+        <w:pStyle w:val="Paragrafoelenco"/>
+        <w:numPr>
+          <w:ilvl w:val="0"/>
+          <w:numId w:val="18"/>
+        </w:numPr>
+        <w:spacing w:after="100" w:line="276" w:lineRule="auto"/>
+      </w:pPr>
+      <w:r>
+        <w:t xml:space="preserve">Vai in </w:t>
+      </w:r>
+      <w:r>
+        <w:rPr>
+          <w:b/>
+          <w:bCs/>
+        </w:rPr>
+        <w:t>Init Settings</w:t>
+      </w:r>
+      <w:r>
+        <w:t xml:space="preserve">, cambia qualche campo e premi "Invia via OSC" (oppure vai in </w:t>
+      </w:r>
+      <w:r>
+        <w:rPr>
+          <w:b/>
+          <w:bCs/>
+        </w:rPr>
+        <w:t>Live Change</w:t>
+      </w:r>
+      <w:r>
+        <w:t xml:space="preserve"> e muovi/tocca un campo): nel terminale dello script comparirà una riga per ogni messaggio ricevuto, con indirizzo OSC, id del campo e valore già decodificato (es. </w:t>
+      </w:r>
+      <w:r>
+        <w:rPr>
+          <w:rFonts w:ascii="Consolas" w:eastAsia="Consolas" w:hAnsi="Consolas" w:cs="Consolas"/>
+          <w:sz w:val="20"/>
+          <w:szCs w:val="20"/>
+        </w:rPr>
+        <w:t>/vr/sliderLive -&gt; sliderLive = 42.5</w:t>
+      </w:r>
+      <w:r>
+        <w:t>).</w:t>
+      </w:r>
+    </w:p>
+    <w:p>
+      <w:pPr>
+        <w:pStyle w:val="Paragrafoelenco"/>
+        <w:numPr>
+          <w:ilvl w:val="0"/>
+          <w:numId w:val="18"/>
+        </w:numPr>
+        <w:spacing w:after="100" w:line="276" w:lineRule="auto"/>
+      </w:pPr>
+      <w:r>
+        <w:t>Premi Ctrl+C nel terminale dello script per fermare l'ascolto.</w:t>
+      </w:r>
+    </w:p>
+    <w:p>
+      <w:pPr>
+        <w:spacing w:after="160" w:line="276" w:lineRule="auto"/>
+      </w:pPr>
+      <w:r>
+        <w:t>Opzioni disponibili (facoltative):</w:t>
+      </w:r>
+    </w:p>
+    <w:p>
+      <w:pPr>
+        <w:pBdr>
+          <w:left w:val="single" w:sz="6" w:space="6" w:color="D0D0D0"/>
+        </w:pBdr>
+        <w:shd w:val="clear" w:color="auto" w:fill="F2F2F2"/>
+        <w:spacing w:before="80" w:after="160"/>
+      </w:pPr>
+      <w:r>
+        <w:rPr>
+          <w:rFonts w:ascii="Consolas" w:eastAsia="Consolas" w:hAnsi="Consolas" w:cs="Consolas"/>
+          <w:sz w:val="19"/>
+          <w:szCs w:val="19"/>
+        </w:rPr>
+        <w:t>python3 tools/test_osc_receiver.py --ip 0.0.0.0 --port 9002 --raw</w:t>
+      </w:r>
+    </w:p>
+    <w:tbl>
+      <w:tblPr>
+        <w:tblW w:w="5000" w:type="pct"/>
+        <w:tblBorders>
+          <w:top w:val="single" w:sz="4" w:space="0" w:color="auto"/>
+          <w:left w:val="single" w:sz="4" w:space="0" w:color="auto"/>
+          <w:bottom w:val="single" w:sz="4" w:space="0" w:color="auto"/>
+          <w:right w:val="single" w:sz="4" w:space="0" w:color="auto"/>
+          <w:insideH w:val="single" w:sz="4" w:space="0" w:color="auto"/>
+          <w:insideV w:val="single" w:sz="4" w:space="0" w:color="auto"/>
+        </w:tblBorders>
+        <w:tblLook w:val="04A0" w:firstRow="1" w:lastRow="0" w:firstColumn="1" w:lastColumn="0" w:noHBand="0" w:noVBand="1"/>
+      </w:tblPr>
+      <w:tblGrid>
+        <w:gridCol w:w="1016"/>
+        <w:gridCol w:w="8682"/>
+      </w:tblGrid>
+      <w:tr>
+        <w:trPr>
+          <w:tblHeader/>
+        </w:trPr>
+        <w:tc>
+          <w:tcPr>
+            <w:tcW w:w="0" w:type="auto"/>
+            <w:shd w:val="clear" w:color="auto" w:fill="DDEBF7"/>
+            <w:tcMar>
+              <w:top w:w="80" w:type="dxa"/>
+              <w:left w:w="100" w:type="dxa"/>
+              <w:bottom w:w="80" w:type="dxa"/>
+              <w:right w:w="100" w:type="dxa"/>
+            </w:tcMar>
+          </w:tcPr>
+          <w:p>
+            <w:r>
+              <w:rPr>
+                <w:b/>
+                <w:bCs/>
+              </w:rPr>
+              <w:t>Opzione</w:t>
+            </w:r>
+          </w:p>
+        </w:tc>
+        <w:tc>
+          <w:tcPr>
+            <w:tcW w:w="0" w:type="auto"/>
+            <w:shd w:val="clear" w:color="auto" w:fill="DDEBF7"/>
+            <w:tcMar>
+              <w:top w:w="80" w:type="dxa"/>
+              <w:left w:w="100" w:type="dxa"/>
+              <w:bottom w:w="80" w:type="dxa"/>
+              <w:right w:w="100" w:type="dxa"/>
+            </w:tcMar>
+          </w:tcPr>
+          <w:p>
+            <w:r>
+              <w:rPr>
+                <w:b/>
+                <w:bCs/>
+              </w:rPr>
+              <w:t>A cosa serve</w:t>
+            </w:r>
+          </w:p>
+        </w:tc>
+      </w:tr>
+      <w:tr>
+        <w:tc>
+          <w:tcPr>
+            <w:tcW w:w="0" w:type="auto"/>
+            <w:tcMar>
+              <w:top w:w="80" w:type="dxa"/>
+              <w:left w:w="100" w:type="dxa"/>
+              <w:bottom w:w="80" w:type="dxa"/>
+              <w:right w:w="100" w:type="dxa"/>
+            </w:tcMar>
+          </w:tcPr>
+          <w:p>
+            <w:pPr>
+              <w:spacing w:line="264" w:lineRule="auto"/>
+            </w:pPr>
+            <w:r>
+              <w:t>--ip</w:t>
+            </w:r>
+          </w:p>
+        </w:tc>
+        <w:tc>
+          <w:tcPr>
+            <w:tcW w:w="0" w:type="auto"/>
+            <w:tcMar>
+              <w:top w:w="80" w:type="dxa"/>
+              <w:left w:w="100" w:type="dxa"/>
+              <w:bottom w:w="80" w:type="dxa"/>
+              <w:right w:w="100" w:type="dxa"/>
+            </w:tcMar>
+          </w:tcPr>
+          <w:p>
+            <w:pPr>
+              <w:spacing w:line="264" w:lineRule="auto"/>
+            </w:pPr>
+            <w:r>
+              <w:t>Indirizzo su cui restare in ascolto (default 0.0.0.0, cioè tutte le interfacce di rete: va bene quasi sempre, anche se l'app gira su un altro dispositivo della stessa rete Wi-Fi)</w:t>
+            </w:r>
+          </w:p>
+        </w:tc>
+      </w:tr>
+      <w:tr>
+        <w:tc>
+          <w:tcPr>
+            <w:tcW w:w="0" w:type="auto"/>
+            <w:tcMar>
+              <w:top w:w="80" w:type="dxa"/>
+              <w:left w:w="100" w:type="dxa"/>
+              <w:bottom w:w="80" w:type="dxa"/>
+              <w:right w:w="100" w:type="dxa"/>
+            </w:tcMar>
+          </w:tcPr>
+          <w:p>
+            <w:pPr>
+              <w:spacing w:line="264" w:lineRule="auto"/>
+            </w:pPr>
+            <w:r>
+              <w:t>--port</w:t>
+            </w:r>
+          </w:p>
+        </w:tc>
+        <w:tc>
+          <w:tcPr>
+            <w:tcW w:w="0" w:type="auto"/>
+            <w:tcMar>
+              <w:top w:w="80" w:type="dxa"/>
+              <w:left w:w="100" w:type="dxa"/>
+              <w:bottom w:w="80" w:type="dxa"/>
+              <w:right w:w="100" w:type="dxa"/>
+            </w:tcMar>
+          </w:tcPr>
+          <w:p>
+            <w:pPr>
+              <w:spacing w:line="264" w:lineRule="auto"/>
+            </w:pPr>
+            <w:r>
+              <w:t>Porta UDP di ascolto (default 9002; deve combaciare con la Porta impostata in "Impostazioni" nell'app)</w:t>
+            </w:r>
+          </w:p>
+        </w:tc>
+      </w:tr>
+      <w:tr>
+        <w:tc>
+          <w:tcPr>
+            <w:tcW w:w="0" w:type="auto"/>
+            <w:tcMar>
+              <w:top w:w="80" w:type="dxa"/>
+              <w:left w:w="100" w:type="dxa"/>
+              <w:bottom w:w="80" w:type="dxa"/>
+              <w:right w:w="100" w:type="dxa"/>
+            </w:tcMar>
+          </w:tcPr>
+          <w:p>
+            <w:pPr>
+              <w:spacing w:line="264" w:lineRule="auto"/>
+            </w:pPr>
+            <w:r>
+              <w:t>--raw</w:t>
+            </w:r>
+          </w:p>
+        </w:tc>
+        <w:tc>
+          <w:tcPr>
+            <w:tcW w:w="0" w:type="auto"/>
+            <w:tcMar>
+              <w:top w:w="80" w:type="dxa"/>
+              <w:left w:w="100" w:type="dxa"/>
+              <w:bottom w:w="80" w:type="dxa"/>
+              <w:right w:w="100" w:type="dxa"/>
+            </w:tcMar>
+          </w:tcPr>
+          <w:p>
+            <w:pPr>
+              <w:spacing w:line="264" w:lineRule="auto"/>
+            </w:pPr>
+            <w:r>
+              <w:t>Mostra anche i byte grezzi di ogni pacchetto ricevuto (utile solo per debug avanzato del formato OSC)</w:t>
+            </w:r>
+          </w:p>
+        </w:tc>
+      </w:tr>
+    </w:tbl>
+    <w:p>
+      <w:pPr>
+        <w:spacing w:after="160" w:line="276" w:lineRule="auto"/>
+      </w:pPr>
+      <w:r>
+        <w:t xml:space="preserve">Se un pacchetto ricevuto non sembra un messaggio OSC valido (es. per errore è arrivato qualcos'altro sulla stessa porta), lo script lo segnala come "pacchetto non OSC valido" invece di fermarsi con un errore: continua ad ascoltare normalmente i messaggi successivi.</w:t>
+      </w:r>
+    </w:p>
+    <w:p>
+      <w:pPr>
         <w:pBdr>
           <w:bottom w:val="single" w:sz="6" w:space="1" w:color="BFBFBF"/>
         </w:pBdr>
@@ -29251,6 +29685,12 @@
   </w:num>
   <w:num w:numId="17" w16cid:durableId="672606454">
     <w:abstractNumId w:val="1"/>
+    <w:lvlOverride w:ilvl="0">
+      <w:startOverride w:val="1"/>
+    </w:lvlOverride>
+  </w:num>
+  <w:num w:numId="18" w16cid:durableId="911046522">
+    <w:abstractNumId w:val="10"/>
     <w:lvlOverride w:ilvl="0">
       <w:startOverride w:val="1"/>
     </w:lvlOverride>

</xml_diff>